<commit_message>
Align design docs to PRD/TRD v1.1 — UI v1.1, Figma v1.2 with canonical journey, frame fix, Paused rules, scope locks
</commit_message>
<xml_diff>
--- a/ROE - Figma UI:UX Design Specification  Mobile-First Experience, Frames, Reusable Components, Role-Based Screens, Clickable Prototype & Design References  .docx
+++ b/ROE - Figma UI:UX Design Specification  Mobile-First Experience, Frames, Reusable Components, Role-Based Screens, Clickable Prototype & Design References  .docx
@@ -100,227 +100,23 @@
         </w:rPr>
       </w:pPr>
       <w:r>
-        <w:rPr>
-          <w:rFonts w:ascii="Times New Roman" w:eastAsia="Times New Roman" w:hAnsi="Times New Roman" w:cs="Times New Roman"/>
-          <w:b/>
-          <w:bCs/>
-          <w:kern w:val="0"/>
-          <w:lang w:eastAsia="en-GB"/>
-          <w14:ligatures w14:val="none"/>
-        </w:rPr>
-        <w:t>Product:</w:t>
-      </w:r>
-      <w:r>
-        <w:rPr>
-          <w:rFonts w:ascii="Times New Roman" w:eastAsia="Times New Roman" w:hAnsi="Times New Roman" w:cs="Times New Roman"/>
-          <w:kern w:val="0"/>
-          <w:lang w:eastAsia="en-GB"/>
-          <w14:ligatures w14:val="none"/>
-        </w:rPr>
-        <w:t xml:space="preserve"> ROE</w:t>
-      </w:r>
-      <w:r>
-        <w:rPr>
-          <w:rFonts w:ascii="Times New Roman" w:eastAsia="Times New Roman" w:hAnsi="Times New Roman" w:cs="Times New Roman"/>
-          <w:kern w:val="0"/>
-          <w:lang w:eastAsia="en-GB"/>
-          <w14:ligatures w14:val="none"/>
-        </w:rPr>
+        <w:t>Product: ROE</w:t>
         <w:br/>
-      </w:r>
-      <w:r>
-        <w:rPr>
-          <w:rFonts w:ascii="Times New Roman" w:eastAsia="Times New Roman" w:hAnsi="Times New Roman" w:cs="Times New Roman"/>
-          <w:b/>
-          <w:bCs/>
-          <w:kern w:val="0"/>
-          <w:lang w:eastAsia="en-GB"/>
-          <w14:ligatures w14:val="none"/>
-        </w:rPr>
-        <w:t>Subtitle:</w:t>
-      </w:r>
-      <w:r>
-        <w:rPr>
-          <w:rFonts w:ascii="Times New Roman" w:eastAsia="Times New Roman" w:hAnsi="Times New Roman" w:cs="Times New Roman"/>
-          <w:kern w:val="0"/>
-          <w:lang w:eastAsia="en-GB"/>
-          <w14:ligatures w14:val="none"/>
-        </w:rPr>
-        <w:t xml:space="preserve"> No one lost to silence</w:t>
-      </w:r>
-      <w:r>
-        <w:rPr>
-          <w:rFonts w:ascii="Times New Roman" w:eastAsia="Times New Roman" w:hAnsi="Times New Roman" w:cs="Times New Roman"/>
-          <w:kern w:val="0"/>
-          <w:lang w:eastAsia="en-GB"/>
-          <w14:ligatures w14:val="none"/>
-        </w:rPr>
+        <w:t>Subtitle: No one lost to silence</w:t>
         <w:br/>
-      </w:r>
-      <w:r>
-        <w:rPr>
-          <w:rFonts w:ascii="Times New Roman" w:eastAsia="Times New Roman" w:hAnsi="Times New Roman" w:cs="Times New Roman"/>
-          <w:b/>
-          <w:bCs/>
-          <w:kern w:val="0"/>
-          <w:lang w:eastAsia="en-GB"/>
-          <w14:ligatures w14:val="none"/>
-        </w:rPr>
-        <w:t>Product concept:</w:t>
-      </w:r>
-      <w:r>
-        <w:rPr>
-          <w:rFonts w:ascii="Times New Roman" w:eastAsia="Times New Roman" w:hAnsi="Times New Roman" w:cs="Times New Roman"/>
-          <w:kern w:val="0"/>
-          <w:lang w:eastAsia="en-GB"/>
-          <w14:ligatures w14:val="none"/>
-        </w:rPr>
-        <w:t xml:space="preserve"> An AI companion that helps new converts and young members grow, and become family.</w:t>
-      </w:r>
-      <w:r>
-        <w:rPr>
-          <w:rFonts w:ascii="Times New Roman" w:eastAsia="Times New Roman" w:hAnsi="Times New Roman" w:cs="Times New Roman"/>
-          <w:kern w:val="0"/>
-          <w:lang w:eastAsia="en-GB"/>
-          <w14:ligatures w14:val="none"/>
-        </w:rPr>
+        <w:t>Product concept: An AI companion that helps new converts and young members grow, and become family.</w:t>
         <w:br/>
-      </w:r>
-      <w:r>
-        <w:rPr>
-          <w:rFonts w:ascii="Times New Roman" w:eastAsia="Times New Roman" w:hAnsi="Times New Roman" w:cs="Times New Roman"/>
-          <w:b/>
-          <w:bCs/>
-          <w:kern w:val="0"/>
-          <w:lang w:eastAsia="en-GB"/>
-          <w14:ligatures w14:val="none"/>
-        </w:rPr>
-        <w:t>Document version:</w:t>
-      </w:r>
-      <w:r>
-        <w:rPr>
-          <w:rFonts w:ascii="Times New Roman" w:eastAsia="Times New Roman" w:hAnsi="Times New Roman" w:cs="Times New Roman"/>
-          <w:kern w:val="0"/>
-          <w:lang w:eastAsia="en-GB"/>
-          <w14:ligatures w14:val="none"/>
-        </w:rPr>
-        <w:t xml:space="preserve"> 1.1</w:t>
-      </w:r>
-      <w:r>
-        <w:rPr>
-          <w:rFonts w:ascii="Times New Roman" w:eastAsia="Times New Roman" w:hAnsi="Times New Roman" w:cs="Times New Roman"/>
-          <w:kern w:val="0"/>
-          <w:lang w:eastAsia="en-GB"/>
-          <w14:ligatures w14:val="none"/>
-        </w:rPr>
+        <w:t>Document version: 1.2</w:t>
         <w:br/>
-      </w:r>
-      <w:r>
-        <w:rPr>
-          <w:rFonts w:ascii="Times New Roman" w:eastAsia="Times New Roman" w:hAnsi="Times New Roman" w:cs="Times New Roman"/>
-          <w:b/>
-          <w:bCs/>
-          <w:kern w:val="0"/>
-          <w:lang w:eastAsia="en-GB"/>
-          <w14:ligatures w14:val="none"/>
-        </w:rPr>
-        <w:t>Purpose:</w:t>
-      </w:r>
-      <w:r>
-        <w:rPr>
-          <w:rFonts w:ascii="Times New Roman" w:eastAsia="Times New Roman" w:hAnsi="Times New Roman" w:cs="Times New Roman"/>
-          <w:kern w:val="0"/>
-          <w:lang w:eastAsia="en-GB"/>
-          <w14:ligatures w14:val="none"/>
-        </w:rPr>
-        <w:t xml:space="preserve"> Figma design and prototyping handoff</w:t>
-      </w:r>
-      <w:r>
-        <w:rPr>
-          <w:rFonts w:ascii="Times New Roman" w:eastAsia="Times New Roman" w:hAnsi="Times New Roman" w:cs="Times New Roman"/>
-          <w:kern w:val="0"/>
-          <w:lang w:eastAsia="en-GB"/>
-          <w14:ligatures w14:val="none"/>
-        </w:rPr>
+        <w:t>Changelog v1.1→v1.2 (9 Oct 2026): P01–P20 vs F01–F18 naming fix, Paused server rules, notifications MVP subset, search default scope, member own-only lock, FUTURE tags enforced, aligned to PRD/TRD v1.1 + UI v1.1.</w:t>
         <w:br/>
-      </w:r>
-      <w:r>
-        <w:rPr>
-          <w:rFonts w:ascii="Times New Roman" w:eastAsia="Times New Roman" w:hAnsi="Times New Roman" w:cs="Times New Roman"/>
-          <w:b/>
-          <w:bCs/>
-          <w:kern w:val="0"/>
-          <w:lang w:eastAsia="en-GB"/>
-          <w14:ligatures w14:val="none"/>
-        </w:rPr>
-        <w:t>Date:</w:t>
-      </w:r>
-      <w:r>
-        <w:rPr>
-          <w:rFonts w:ascii="Times New Roman" w:eastAsia="Times New Roman" w:hAnsi="Times New Roman" w:cs="Times New Roman"/>
-          <w:kern w:val="0"/>
-          <w:lang w:eastAsia="en-GB"/>
-          <w14:ligatures w14:val="none"/>
-        </w:rPr>
-        <w:t xml:space="preserve"> 8 October 2026</w:t>
-      </w:r>
-      <w:r>
-        <w:rPr>
-          <w:rFonts w:ascii="Times New Roman" w:eastAsia="Times New Roman" w:hAnsi="Times New Roman" w:cs="Times New Roman"/>
-          <w:kern w:val="0"/>
-          <w:lang w:eastAsia="en-GB"/>
-          <w14:ligatures w14:val="none"/>
-        </w:rPr>
+        <w:t>Purpose: Figma design and prototyping handoff</w:t>
         <w:br/>
-      </w:r>
-      <w:r>
-        <w:rPr>
-          <w:rFonts w:ascii="Times New Roman" w:eastAsia="Times New Roman" w:hAnsi="Times New Roman" w:cs="Times New Roman"/>
-          <w:b/>
-          <w:bCs/>
-          <w:kern w:val="0"/>
-          <w:lang w:eastAsia="en-GB"/>
-          <w14:ligatures w14:val="none"/>
-        </w:rPr>
-        <w:t>Design priority:</w:t>
-      </w:r>
-      <w:r>
-        <w:rPr>
-          <w:rFonts w:ascii="Times New Roman" w:eastAsia="Times New Roman" w:hAnsi="Times New Roman" w:cs="Times New Roman"/>
-          <w:kern w:val="0"/>
-          <w:lang w:eastAsia="en-GB"/>
-          <w14:ligatures w14:val="none"/>
-        </w:rPr>
-        <w:t xml:space="preserve"> Human-first, mobile-first, highly responsive</w:t>
-      </w:r>
-      <w:r>
-        <w:rPr>
-          <w:rFonts w:ascii="Times New Roman" w:eastAsia="Times New Roman" w:hAnsi="Times New Roman" w:cs="Times New Roman"/>
-          <w:kern w:val="0"/>
-          <w:lang w:eastAsia="en-GB"/>
-          <w14:ligatures w14:val="none"/>
-        </w:rPr>
+        <w:t>Date: 8 October 2026</w:t>
         <w:br/>
-      </w:r>
-      <w:r>
-        <w:rPr>
-          <w:rFonts w:ascii="Times New Roman" w:eastAsia="Times New Roman" w:hAnsi="Times New Roman" w:cs="Times New Roman"/>
-          <w:b/>
-          <w:bCs/>
-          <w:kern w:val="0"/>
-          <w:lang w:eastAsia="en-GB"/>
-          <w14:ligatures w14:val="none"/>
-        </w:rPr>
-        <w:t>Product scope:</w:t>
-      </w:r>
-      <w:r>
-        <w:rPr>
-          <w:rFonts w:ascii="Times New Roman" w:eastAsia="Times New Roman" w:hAnsi="Times New Roman" w:cs="Times New Roman"/>
-          <w:kern w:val="0"/>
-          <w:lang w:eastAsia="en-GB"/>
-          <w14:ligatures w14:val="none"/>
-        </w:rPr>
-        <w:t xml:space="preserve"> Agreed MVP first, broader vision clearly separated</w:t>
+        <w:t>Design priority: Human-first, mobile-first, highly responsive</w:t>
+        <w:br/>
+        <w:t>Product scope: Agreed MVP first, broader vision clearly separated</w:t>
       </w:r>
     </w:p>
     <w:p>
@@ -33493,6 +33289,184 @@
       </w:r>
     </w:p>
     <w:p/>
+    <w:p>
+      <w:pPr>
+        <w:pStyle w:val="Heading1"/>
+      </w:pPr>
+      <w:r>
+        <w:t>20. v1.2 BUILD ALIGNMENT ADDENDUM (normative)</w:t>
+      </w:r>
+    </w:p>
+    <w:p>
+      <w:r>
+        <w:t>Wins over any earlier conflicting frame ID, state, or scope. Aligned to PRD v1.1, TRD v1.1, UI System v1.1.</w:t>
+      </w:r>
+    </w:p>
+    <w:p>
+      <w:pPr>
+        <w:pStyle w:val="Heading2"/>
+      </w:pPr>
+      <w:r>
+        <w:t>20.1 Frame naming — stop the clash</w:t>
+      </w:r>
+    </w:p>
+    <w:p>
+      <w:r>
+        <w:t>Prototype = P01–P20: P01 Login, P02 Home, P03 People, P04 Create, P05 Created, P06 Assign, P07 Profile, P08 Action Detail, P09 In Progress, P10 Record, P11 Recorded, P12 Journey, P13 Suggested, P14 Intro, P15 Sent, P16 Participation, P17 Confirmed, P18 Next Action, P19 Updated Profile (variant of P07), P20 Updated Home (variant of P02). System = F01–F18 (F01 auth, F02 home, F03 people, F04 profile, F05 actions, F06 connections, F08 care FUTURE, F09 celebrations FUTURE, F12 insights FUTURE, F13 AI FUTURE, F17 states, F18 mobile). Rename Figma pages 05/06/08 to P-prefix for prototype flows; keep F-prefix for system index.</w:t>
+      </w:r>
+    </w:p>
+    <w:p>
+      <w:pPr>
+        <w:pStyle w:val="Heading2"/>
+      </w:pPr>
+      <w:r>
+        <w:t>20.2 Paused + statuses (TRD §17)</w:t>
+      </w:r>
+    </w:p>
+    <w:p>
+      <w:r>
+        <w:t>Action: Open→In Progress→Completed; Overdue derived; Open|In Progress→Paused needs reason, freezes due_at for sort, still shows in Today as Paused; Paused→In Progress on resume; only assignee|admin. Journey NEW…BELONGING and Operational OPEN…PAUSED are separate families — overdue task is never a person judgment.</w:t>
+      </w:r>
+    </w:p>
+    <w:p>
+      <w:pPr>
+        <w:pStyle w:val="Heading2"/>
+      </w:pPr>
+      <w:r>
+        <w:t>20.3 Scope locks</w:t>
+      </w:r>
+    </w:p>
+    <w:p>
+      <w:r>
+        <w:t>MVP builds ONLY P01–P20 + F01–F06 + F17–F18 at MVP depth. F08/F09/F12/F13 and §7.10/§10 future components (Care, Celebrations, Insights, AI Assistant, advanced admin) are FUTURE-DO-NOT-BUILD. Notifications MVP: assignment/due/overdue/intro/connection only.</w:t>
+      </w:r>
+    </w:p>
+    <w:p>
+      <w:pPr>
+        <w:pStyle w:val="Heading2"/>
+      </w:pPr>
+      <w:r>
+        <w:t>20.4 Search + member + privacy</w:t>
+      </w:r>
+    </w:p>
+    <w:p>
+      <w:r>
+        <w:t>Search default = Assigned + Shared; org-wide needs grant; Member = own record + own connections + own prefs only (PRD §20). Human Context Card shows only context needed for next step, never sensitive header data. PermissionRestricted overlay must not flash restricted content first.</w:t>
+      </w:r>
+    </w:p>
+    <w:tbl>
+      <w:tblPr>
+        <w:tblW w:type="auto" w:w="0"/>
+        <w:tblLook w:firstColumn="1" w:firstRow="1" w:lastColumn="0" w:lastRow="0" w:noHBand="0" w:noVBand="1" w:val="04A0"/>
+      </w:tblPr>
+      <w:tblGrid>
+        <w:gridCol w:w="3009"/>
+        <w:gridCol w:w="3009"/>
+        <w:gridCol w:w="3009"/>
+      </w:tblGrid>
+      <w:tr>
+        <w:tc>
+          <w:tcPr>
+            <w:tcW w:type="dxa" w:w="3009"/>
+          </w:tcPr>
+          <w:p>
+            <w:r>
+              <w:t>Prototype</w:t>
+            </w:r>
+          </w:p>
+        </w:tc>
+        <w:tc>
+          <w:tcPr>
+            <w:tcW w:type="dxa" w:w="3009"/>
+          </w:tcPr>
+          <w:p>
+            <w:r>
+              <w:t>System</w:t>
+            </w:r>
+          </w:p>
+        </w:tc>
+        <w:tc>
+          <w:tcPr>
+            <w:tcW w:type="dxa" w:w="3009"/>
+          </w:tcPr>
+          <w:p>
+            <w:r>
+              <w:t>Note</w:t>
+            </w:r>
+          </w:p>
+        </w:tc>
+      </w:tr>
+      <w:tr>
+        <w:tc>
+          <w:tcPr>
+            <w:tcW w:type="dxa" w:w="3009"/>
+          </w:tcPr>
+          <w:p>
+            <w:r>
+              <w:t>P19</w:t>
+            </w:r>
+          </w:p>
+        </w:tc>
+        <w:tc>
+          <w:tcPr>
+            <w:tcW w:type="dxa" w:w="3009"/>
+          </w:tcPr>
+          <w:p>
+            <w:r>
+              <w:t>F04 variant</w:t>
+            </w:r>
+          </w:p>
+        </w:tc>
+        <w:tc>
+          <w:tcPr>
+            <w:tcW w:type="dxa" w:w="3009"/>
+          </w:tcPr>
+          <w:p>
+            <w:r>
+              <w:t>same components, new recorded state</w:t>
+            </w:r>
+          </w:p>
+        </w:tc>
+      </w:tr>
+      <w:tr>
+        <w:tc>
+          <w:tcPr>
+            <w:tcW w:type="dxa" w:w="3009"/>
+          </w:tcPr>
+          <w:p>
+            <w:r>
+              <w:t>P20</w:t>
+            </w:r>
+          </w:p>
+        </w:tc>
+        <w:tc>
+          <w:tcPr>
+            <w:tcW w:type="dxa" w:w="3009"/>
+          </w:tcPr>
+          <w:p>
+            <w:r>
+              <w:t>F02 variant</w:t>
+            </w:r>
+          </w:p>
+        </w:tc>
+        <w:tc>
+          <w:tcPr>
+            <w:tcW w:type="dxa" w:w="3009"/>
+          </w:tcPr>
+          <w:p>
+            <w:r>
+              <w:t>completed leaves open list; next appears; no false “all done”</w:t>
+            </w:r>
+          </w:p>
+        </w:tc>
+      </w:tr>
+    </w:tbl>
+    <w:p/>
+    <w:p>
+      <w:r>
+        <w:t>ROE — No one lost to silence.</w:t>
+      </w:r>
+    </w:p>
     <w:sectPr>
       <w:pgSz w:w="11906" w:h="16838"/>
       <w:pgMar w:top="1440" w:right="1440" w:bottom="1440" w:left="1440" w:header="708" w:footer="708" w:gutter="0"/>

</xml_diff>